<commit_message>
Update CV (docx and pdf)
</commit_message>
<xml_diff>
--- a/Rashed_AlQatarneh_CV.docx
+++ b/Rashed_AlQatarneh_CV.docx
@@ -111,16 +111,7 @@
           <w:sz w:val="19"/>
           <w:szCs w:val="19"/>
         </w:rPr>
-        <w:t xml:space="preserve"> markets. Specializes in distributed systems</w:t>
-      </w:r>
-      <w:r>
-        <w:rPr>
-          <w:rFonts w:ascii="Arial" w:eastAsia="Arial" w:hAnsi="Arial" w:cs="Arial"/>
-          <w:color w:val="1A1A1A"/>
-          <w:sz w:val="19"/>
-          <w:szCs w:val="19"/>
-        </w:rPr>
-        <w:t xml:space="preserve"> </w:t>
+        <w:t xml:space="preserve"> markets. Specializes in distributed systems </w:t>
       </w:r>
       <w:r>
         <w:rPr>
@@ -223,6 +214,102 @@
           <w:szCs w:val="19"/>
         </w:rPr>
         <w:t xml:space="preserve">    Jun 2025 – Present</w:t>
+      </w:r>
+    </w:p>
+    <w:p>
+      <w:pPr>
+        <w:pStyle w:val="ListParagraph"/>
+        <w:numPr>
+          <w:ilvl w:val="0"/>
+          <w:numId w:val="2"/>
+        </w:numPr>
+        <w:rPr>
+          <w:rFonts w:ascii="Arial" w:eastAsia="Arial" w:hAnsi="Arial" w:cs="Arial"/>
+          <w:color w:val="1A1A1A"/>
+          <w:sz w:val="19"/>
+          <w:szCs w:val="19"/>
+        </w:rPr>
+      </w:pPr>
+      <w:r>
+        <w:rPr>
+          <w:rFonts w:ascii="Arial" w:eastAsia="Arial" w:hAnsi="Arial" w:cs="Arial"/>
+          <w:color w:val="1A1A1A"/>
+          <w:sz w:val="19"/>
+          <w:szCs w:val="19"/>
+        </w:rPr>
+        <w:t xml:space="preserve">Owned the full payment lifecycle, a large-scale payment integrations across AMET marketplaces (Africa, Middle East, and Turkey) serving millions of customers as the single technical owner of all integrations end-to-end. </w:t>
+      </w:r>
+    </w:p>
+    <w:p>
+      <w:pPr>
+        <w:pStyle w:val="ListParagraph"/>
+        <w:numPr>
+          <w:ilvl w:val="0"/>
+          <w:numId w:val="2"/>
+        </w:numPr>
+        <w:rPr>
+          <w:rFonts w:ascii="Arial" w:eastAsia="Arial" w:hAnsi="Arial" w:cs="Arial"/>
+          <w:color w:val="1A1A1A"/>
+          <w:sz w:val="19"/>
+          <w:szCs w:val="19"/>
+        </w:rPr>
+      </w:pPr>
+      <w:r>
+        <w:rPr>
+          <w:rFonts w:ascii="Arial" w:eastAsia="Arial" w:hAnsi="Arial" w:cs="Arial"/>
+          <w:color w:val="1A1A1A"/>
+          <w:sz w:val="19"/>
+          <w:szCs w:val="19"/>
+        </w:rPr>
+        <w:t xml:space="preserve">Resolved a long-standing stuck workflow reliability issue that affected 10,000+ customers, in a highly complex processor integration by identifying non-obvious external inconsistencies and addressing multiple underlying system gaps, resulting in a measurable reduction in pipeline blockage </w:t>
+      </w:r>
+    </w:p>
+    <w:p>
+      <w:pPr>
+        <w:pStyle w:val="ListParagraph"/>
+        <w:numPr>
+          <w:ilvl w:val="0"/>
+          <w:numId w:val="2"/>
+        </w:numPr>
+        <w:rPr>
+          <w:rFonts w:ascii="Arial" w:eastAsia="Arial" w:hAnsi="Arial" w:cs="Arial"/>
+          <w:color w:val="1A1A1A"/>
+          <w:sz w:val="19"/>
+          <w:szCs w:val="19"/>
+        </w:rPr>
+      </w:pPr>
+      <w:r>
+        <w:rPr>
+          <w:rFonts w:ascii="Arial" w:eastAsia="Arial" w:hAnsi="Arial" w:cs="Arial"/>
+          <w:color w:val="1A1A1A"/>
+          <w:sz w:val="19"/>
+          <w:szCs w:val="19"/>
+        </w:rPr>
+        <w:t xml:space="preserve">Improved monitoring and alerting infrastructure by designing a real-time payment availability monitoring system tracking processor health per operation type, detecting partner outages automatically, and alerting the team before customer-facing degradation occurs, resulting in 60% faster incident detection and 50% reduction in alert noise, reducing on-call load and improving mean time to recovery. </w:t>
+      </w:r>
+    </w:p>
+    <w:p>
+      <w:pPr>
+        <w:pStyle w:val="ListParagraph"/>
+        <w:numPr>
+          <w:ilvl w:val="0"/>
+          <w:numId w:val="2"/>
+        </w:numPr>
+        <w:rPr>
+          <w:rFonts w:ascii="Arial" w:eastAsia="Arial" w:hAnsi="Arial" w:cs="Arial"/>
+          <w:color w:val="1A1A1A"/>
+          <w:sz w:val="19"/>
+          <w:szCs w:val="19"/>
+        </w:rPr>
+      </w:pPr>
+      <w:r>
+        <w:rPr>
+          <w:rFonts w:ascii="Arial" w:eastAsia="Arial" w:hAnsi="Arial" w:cs="Arial"/>
+          <w:color w:val="1A1A1A"/>
+          <w:sz w:val="19"/>
+          <w:szCs w:val="19"/>
+        </w:rPr>
+        <w:t xml:space="preserve">Conceived and built “Payment AI Integration Authority,” an end-to-end platform automating processor onboarding across requirements, TPS, infrastructure provisioning, and code generation. Originated as a hackathon-winning idea, later reviewed and approved org-wide, and adopted as a reference architecture. Led the full implementation from concept to production including MCP foundations and AI integrations, reducing onboarding time from weeks to days </w:t>
       </w:r>
     </w:p>
     <w:p>
@@ -241,7 +328,7 @@
           <w:sz w:val="19"/>
           <w:szCs w:val="19"/>
         </w:rPr>
-        <w:t>Owned the full transaction lifecycle authorization, capture, refund, and verification across three major global payment processors serving millions of customers in 6+ emerging markets, acting as the single technical owner of all processor integrations end-to-end.</w:t>
+        <w:t>Migrated remittance and chargeback file processing to a standardized SFTP-based platform, onboarding a new marketplace with zero processing downtime by deploying AWS CDK infrastructure (TypeScript) across 21 configuration files hardened with SecureCDK security blueprints, establishing secure partner connectivity via SSH key authentication and IP allowlisting, and uncovering a cross-environment alarm isolation defect silently generating false production alerts across 6 existing Middle East banking partners.</w:t>
       </w:r>
     </w:p>
     <w:p>
@@ -260,43 +347,7 @@
           <w:sz w:val="19"/>
           <w:szCs w:val="19"/>
         </w:rPr>
-        <w:t>Resolved a years-long stuck workflow problem on the most complex payment processor integration</w:t>
-      </w:r>
-      <w:r>
-        <w:rPr>
-          <w:rFonts w:ascii="Arial" w:eastAsia="Arial" w:hAnsi="Arial" w:cs="Arial"/>
-          <w:color w:val="1A1A1A"/>
-          <w:sz w:val="19"/>
-          <w:szCs w:val="19"/>
-        </w:rPr>
-        <w:t xml:space="preserve">, </w:t>
-      </w:r>
-      <w:r>
-        <w:rPr>
-          <w:rFonts w:ascii="Arial" w:eastAsia="Arial" w:hAnsi="Arial" w:cs="Arial"/>
-          <w:color w:val="1A1A1A"/>
-          <w:sz w:val="19"/>
-          <w:szCs w:val="19"/>
-        </w:rPr>
-        <w:t xml:space="preserve">tracing what appeared to be processor infrastructure failures to an issuer-side 3DS authentication defect returning empty redirect URLs, fixing 3 code-level bugs: </w:t>
-      </w:r>
-      <w:r>
-        <w:rPr>
-          <w:rFonts w:ascii="Arial" w:eastAsia="Arial" w:hAnsi="Arial" w:cs="Arial"/>
-          <w:color w:val="1A1A1A"/>
-          <w:sz w:val="19"/>
-          <w:szCs w:val="19"/>
-        </w:rPr>
-        <w:t>refunded</w:t>
-      </w:r>
-      <w:r>
-        <w:rPr>
-          <w:rFonts w:ascii="Arial" w:eastAsia="Arial" w:hAnsi="Arial" w:cs="Arial"/>
-          <w:color w:val="1A1A1A"/>
-          <w:sz w:val="19"/>
-          <w:szCs w:val="19"/>
-        </w:rPr>
-        <w:t xml:space="preserve"> events silently ignored on DynamoDB mapping expiry, 24-hour auto-approve failing due to stale cache reads, and late failure events skipped after premature auto-approval</w:t>
+        <w:t>Built a full-stack serverless performance dashboard from scratch</w:t>
       </w:r>
       <w:r>
         <w:rPr>
@@ -314,7 +365,72 @@
           <w:sz w:val="19"/>
           <w:szCs w:val="19"/>
         </w:rPr>
-        <w:t xml:space="preserve"> driving cross-team coordination to unblock refund processing stuck for over a month, with stuck workflow counts dropping measurably across the payment pipeline.</w:t>
+        <w:t xml:space="preserve"> React frontend, AWS Lambda backend, API Gateway with JWT authentication</w:t>
+      </w:r>
+      <w:r>
+        <w:rPr>
+          <w:rFonts w:ascii="Arial" w:eastAsia="Arial" w:hAnsi="Arial" w:cs="Arial"/>
+          <w:color w:val="1A1A1A"/>
+          <w:sz w:val="19"/>
+          <w:szCs w:val="19"/>
+        </w:rPr>
+        <w:t>,</w:t>
+      </w:r>
+      <w:r>
+        <w:rPr>
+          <w:rFonts w:ascii="Arial" w:eastAsia="Arial" w:hAnsi="Arial" w:cs="Arial"/>
+          <w:color w:val="1A1A1A"/>
+          <w:sz w:val="19"/>
+          <w:szCs w:val="19"/>
+        </w:rPr>
+        <w:t xml:space="preserve"> that auto-generates monthly and quarterly reports for leadership, eliminating hours of manual data collection per reporting cycle.</w:t>
+      </w:r>
+    </w:p>
+    <w:p>
+      <w:pPr>
+        <w:spacing w:before="160" w:after="40"/>
+      </w:pPr>
+      <w:r>
+        <w:rPr>
+          <w:rFonts w:ascii="Arial" w:eastAsia="Arial" w:hAnsi="Arial" w:cs="Arial"/>
+          <w:b/>
+          <w:bCs/>
+          <w:color w:val="1A1A1A"/>
+          <w:sz w:val="21"/>
+          <w:szCs w:val="21"/>
+        </w:rPr>
+        <w:t>Bank Al-Bilad (outsourcing)</w:t>
+      </w:r>
+      <w:r>
+        <w:rPr>
+          <w:rFonts w:ascii="Arial" w:eastAsia="Arial" w:hAnsi="Arial" w:cs="Arial"/>
+          <w:color w:val="555555"/>
+          <w:sz w:val="21"/>
+          <w:szCs w:val="21"/>
+        </w:rPr>
+        <w:t xml:space="preserve">  |  </w:t>
+      </w:r>
+      <w:r>
+        <w:rPr>
+          <w:rFonts w:ascii="Arial" w:eastAsia="Arial" w:hAnsi="Arial" w:cs="Arial"/>
+          <w:b/>
+          <w:bCs/>
+          <w:color w:val="1A1A1A"/>
+          <w:sz w:val="21"/>
+          <w:szCs w:val="21"/>
+        </w:rPr>
+        <w:t>Java Developer</w:t>
+      </w:r>
+      <w:r>
+        <w:rPr>
+          <w:rFonts w:ascii="Arial" w:eastAsia="Arial" w:hAnsi="Arial" w:cs="Arial"/>
+          <w:i/>
+          <w:iCs/>
+          <w:color w:val="555555"/>
+          <w:sz w:val="19"/>
+          <w:szCs w:val="19"/>
+        </w:rPr>
+        <w:t xml:space="preserve">    Jan 2025 – Jun 2025</w:t>
       </w:r>
     </w:p>
     <w:p>
@@ -333,7 +449,7 @@
           <w:sz w:val="19"/>
           <w:szCs w:val="19"/>
         </w:rPr>
-        <w:t>Designed and implemented a real-time payment availability monitoring system that tracks processor health per operation type, detects partner outages automatically via custom detection algorithms, and fires team alerts before customer-facing degradation occurs</w:t>
+        <w:t>Built a Customer Request Service enabling clients to submit and track requests with an admin management layer</w:t>
       </w:r>
       <w:r>
         <w:rPr>
@@ -351,7 +467,7 @@
           <w:sz w:val="19"/>
           <w:szCs w:val="19"/>
         </w:rPr>
-        <w:t xml:space="preserve"> closing a critical observability gap across multiple payment services.</w:t>
+        <w:t xml:space="preserve"> implementing JWT authentication, LDAP login, and route access control by Channel ID and Client Version to meet strict banking security requirements.</w:t>
       </w:r>
     </w:p>
     <w:p>
@@ -370,79 +486,54 @@
           <w:sz w:val="19"/>
           <w:szCs w:val="19"/>
         </w:rPr>
-        <w:t>Built PAIA (Payment AI Integration Authority)</w:t>
-      </w:r>
-      <w:r>
-        <w:rPr>
-          <w:rFonts w:ascii="Arial" w:eastAsia="Arial" w:hAnsi="Arial" w:cs="Arial"/>
-          <w:color w:val="1A1A1A"/>
-          <w:sz w:val="19"/>
-          <w:szCs w:val="19"/>
-        </w:rPr>
-        <w:t>,</w:t>
-      </w:r>
-      <w:r>
-        <w:rPr>
-          <w:rFonts w:ascii="Arial" w:eastAsia="Arial" w:hAnsi="Arial" w:cs="Arial"/>
-          <w:color w:val="1A1A1A"/>
-          <w:sz w:val="19"/>
-          <w:szCs w:val="19"/>
-        </w:rPr>
-        <w:t xml:space="preserve"> an internal platform that automates payment processor integration onboarding end-to-end, covering requirements gathering, TPS configuration, infrastructure provisioning, and code generation across 16 compliance domains. Extended the platform with an AI-powered in-wizard chatbot that loads full workflow context per step, streams real-time guidance, and supports quick-start prompts for step validation and consistency checks</w:t>
-      </w:r>
-      <w:r>
-        <w:rPr>
-          <w:rFonts w:ascii="Arial" w:eastAsia="Arial" w:hAnsi="Arial" w:cs="Arial"/>
-          <w:color w:val="1A1A1A"/>
-          <w:sz w:val="19"/>
-          <w:szCs w:val="19"/>
-        </w:rPr>
-        <w:t>,</w:t>
-      </w:r>
-      <w:r>
-        <w:rPr>
-          <w:rFonts w:ascii="Arial" w:eastAsia="Arial" w:hAnsi="Arial" w:cs="Arial"/>
-          <w:color w:val="1A1A1A"/>
-          <w:sz w:val="19"/>
-          <w:szCs w:val="19"/>
-        </w:rPr>
-        <w:t xml:space="preserve"> eliminating manual compliance review and reducing processor onboarding from </w:t>
-      </w:r>
-      <w:r>
-        <w:rPr>
-          <w:rFonts w:ascii="Arial" w:eastAsia="Arial" w:hAnsi="Arial" w:cs="Arial"/>
-          <w:color w:val="1A1A1A"/>
-          <w:sz w:val="19"/>
-          <w:szCs w:val="19"/>
-        </w:rPr>
-        <w:t>weeks</w:t>
-      </w:r>
-      <w:r>
-        <w:rPr>
-          <w:rFonts w:ascii="Arial" w:eastAsia="Arial" w:hAnsi="Arial" w:cs="Arial"/>
-          <w:color w:val="1A1A1A"/>
-          <w:sz w:val="19"/>
-          <w:szCs w:val="19"/>
-        </w:rPr>
-        <w:t xml:space="preserve"> to </w:t>
-      </w:r>
-      <w:r>
-        <w:rPr>
-          <w:rFonts w:ascii="Arial" w:eastAsia="Arial" w:hAnsi="Arial" w:cs="Arial"/>
-          <w:color w:val="1A1A1A"/>
-          <w:sz w:val="19"/>
-          <w:szCs w:val="19"/>
-        </w:rPr>
-        <w:t>days</w:t>
-      </w:r>
-      <w:r>
-        <w:rPr>
-          <w:rFonts w:ascii="Arial" w:eastAsia="Arial" w:hAnsi="Arial" w:cs="Arial"/>
-          <w:color w:val="1A1A1A"/>
-          <w:sz w:val="19"/>
-          <w:szCs w:val="19"/>
-        </w:rPr>
-        <w:t>.</w:t>
+        <w:t>Designed RESTful APIs with role-based access control (RBAC), applying SOLID principles and design patterns (Factory, Singleton, Strategy) to deliver a maintainable, production-grade service in a regulated financial environment.</w:t>
+      </w:r>
+    </w:p>
+    <w:p>
+      <w:pPr>
+        <w:spacing w:before="160" w:after="40"/>
+      </w:pPr>
+      <w:r>
+        <w:rPr>
+          <w:rFonts w:ascii="Arial" w:eastAsia="Arial" w:hAnsi="Arial" w:cs="Arial"/>
+          <w:b/>
+          <w:bCs/>
+          <w:color w:val="1A1A1A"/>
+          <w:sz w:val="21"/>
+          <w:szCs w:val="21"/>
+        </w:rPr>
+        <w:t>Inspire for Solutions Development</w:t>
+      </w:r>
+      <w:r>
+        <w:rPr>
+          <w:rFonts w:ascii="Arial" w:eastAsia="Arial" w:hAnsi="Arial" w:cs="Arial"/>
+          <w:color w:val="555555"/>
+          <w:sz w:val="21"/>
+          <w:szCs w:val="21"/>
+        </w:rPr>
+        <w:t xml:space="preserve">  |  </w:t>
+      </w:r>
+      <w:r>
+        <w:rPr>
+          <w:rFonts w:ascii="Arial" w:eastAsia="Arial" w:hAnsi="Arial" w:cs="Arial"/>
+          <w:b/>
+          <w:bCs/>
+          <w:color w:val="1A1A1A"/>
+          <w:sz w:val="21"/>
+          <w:szCs w:val="21"/>
+        </w:rPr>
+        <w:t>Java Developer</w:t>
+      </w:r>
+      <w:r>
+        <w:rPr>
+          <w:rFonts w:ascii="Arial" w:eastAsia="Arial" w:hAnsi="Arial" w:cs="Arial"/>
+          <w:i/>
+          <w:iCs/>
+          <w:color w:val="555555"/>
+          <w:sz w:val="19"/>
+          <w:szCs w:val="19"/>
+        </w:rPr>
+        <w:t xml:space="preserve">    Sep 2024 – Jun 2025</w:t>
       </w:r>
     </w:p>
     <w:p>
@@ -461,7 +552,25 @@
           <w:sz w:val="19"/>
           <w:szCs w:val="19"/>
         </w:rPr>
-        <w:t>Migrated remittance and chargeback file processing to a standardized SFTP-based platform, onboarding a new marketplace with zero processing downtime by deploying AWS CDK infrastructure (TypeScript) across 21 configuration files hardened with SecureCDK security blueprints, establishing secure partner connectivity via SSH key authentication and IP allowlisting, and uncovering a cross-environment alarm isolation defect silently generating false production alerts across 6 existing Middle East banking partners.</w:t>
+        <w:t>Designed and built a scalable microservices banking application using Spring Boot, Kafka for async inter-service messaging, GraphQL for flexible data fetching, and the Saga pattern for distributed transaction reliability</w:t>
+      </w:r>
+      <w:r>
+        <w:rPr>
+          <w:rFonts w:ascii="Arial" w:eastAsia="Arial" w:hAnsi="Arial" w:cs="Arial"/>
+          <w:color w:val="1A1A1A"/>
+          <w:sz w:val="19"/>
+          <w:szCs w:val="19"/>
+        </w:rPr>
+        <w:t>,</w:t>
+      </w:r>
+      <w:r>
+        <w:rPr>
+          <w:rFonts w:ascii="Arial" w:eastAsia="Arial" w:hAnsi="Arial" w:cs="Arial"/>
+          <w:color w:val="1A1A1A"/>
+          <w:sz w:val="19"/>
+          <w:szCs w:val="19"/>
+        </w:rPr>
+        <w:t xml:space="preserve"> deployed via Docker.</w:t>
       </w:r>
     </w:p>
     <w:p>
@@ -480,249 +589,6 @@
           <w:sz w:val="19"/>
           <w:szCs w:val="19"/>
         </w:rPr>
-        <w:t>Built a full-stack serverless performance dashboard from scratch</w:t>
-      </w:r>
-      <w:r>
-        <w:rPr>
-          <w:rFonts w:ascii="Arial" w:eastAsia="Arial" w:hAnsi="Arial" w:cs="Arial"/>
-          <w:color w:val="1A1A1A"/>
-          <w:sz w:val="19"/>
-          <w:szCs w:val="19"/>
-        </w:rPr>
-        <w:t>,</w:t>
-      </w:r>
-      <w:r>
-        <w:rPr>
-          <w:rFonts w:ascii="Arial" w:eastAsia="Arial" w:hAnsi="Arial" w:cs="Arial"/>
-          <w:color w:val="1A1A1A"/>
-          <w:sz w:val="19"/>
-          <w:szCs w:val="19"/>
-        </w:rPr>
-        <w:t xml:space="preserve"> React frontend, AWS Lambda backend, API Gateway with JWT authentication</w:t>
-      </w:r>
-      <w:r>
-        <w:rPr>
-          <w:rFonts w:ascii="Arial" w:eastAsia="Arial" w:hAnsi="Arial" w:cs="Arial"/>
-          <w:color w:val="1A1A1A"/>
-          <w:sz w:val="19"/>
-          <w:szCs w:val="19"/>
-        </w:rPr>
-        <w:t>,</w:t>
-      </w:r>
-      <w:r>
-        <w:rPr>
-          <w:rFonts w:ascii="Arial" w:eastAsia="Arial" w:hAnsi="Arial" w:cs="Arial"/>
-          <w:color w:val="1A1A1A"/>
-          <w:sz w:val="19"/>
-          <w:szCs w:val="19"/>
-        </w:rPr>
-        <w:t xml:space="preserve"> that auto-generates monthly and quarterly reports for leadership, eliminating hours of manual data collection per reporting cycle.</w:t>
-      </w:r>
-    </w:p>
-    <w:p>
-      <w:pPr>
-        <w:spacing w:before="160" w:after="40"/>
-      </w:pPr>
-      <w:r>
-        <w:rPr>
-          <w:rFonts w:ascii="Arial" w:eastAsia="Arial" w:hAnsi="Arial" w:cs="Arial"/>
-          <w:b/>
-          <w:bCs/>
-          <w:color w:val="1A1A1A"/>
-          <w:sz w:val="21"/>
-          <w:szCs w:val="21"/>
-        </w:rPr>
-        <w:t>Bank Al-Bilad (outsourcing)</w:t>
-      </w:r>
-      <w:r>
-        <w:rPr>
-          <w:rFonts w:ascii="Arial" w:eastAsia="Arial" w:hAnsi="Arial" w:cs="Arial"/>
-          <w:color w:val="555555"/>
-          <w:sz w:val="21"/>
-          <w:szCs w:val="21"/>
-        </w:rPr>
-        <w:t xml:space="preserve">  |  </w:t>
-      </w:r>
-      <w:r>
-        <w:rPr>
-          <w:rFonts w:ascii="Arial" w:eastAsia="Arial" w:hAnsi="Arial" w:cs="Arial"/>
-          <w:b/>
-          <w:bCs/>
-          <w:color w:val="1A1A1A"/>
-          <w:sz w:val="21"/>
-          <w:szCs w:val="21"/>
-        </w:rPr>
-        <w:t>Java Developer</w:t>
-      </w:r>
-      <w:r>
-        <w:rPr>
-          <w:rFonts w:ascii="Arial" w:eastAsia="Arial" w:hAnsi="Arial" w:cs="Arial"/>
-          <w:i/>
-          <w:iCs/>
-          <w:color w:val="555555"/>
-          <w:sz w:val="19"/>
-          <w:szCs w:val="19"/>
-        </w:rPr>
-        <w:t xml:space="preserve">    Jan 2025 – Jun 2025</w:t>
-      </w:r>
-    </w:p>
-    <w:p>
-      <w:pPr>
-        <w:pStyle w:val="ListParagraph"/>
-        <w:numPr>
-          <w:ilvl w:val="0"/>
-          <w:numId w:val="2"/>
-        </w:numPr>
-        <w:spacing w:before="60" w:after="60"/>
-      </w:pPr>
-      <w:r>
-        <w:rPr>
-          <w:rFonts w:ascii="Arial" w:eastAsia="Arial" w:hAnsi="Arial" w:cs="Arial"/>
-          <w:color w:val="1A1A1A"/>
-          <w:sz w:val="19"/>
-          <w:szCs w:val="19"/>
-        </w:rPr>
-        <w:t>Built a Customer Request Service enabling clients to submit and track requests with an admin management layer</w:t>
-      </w:r>
-      <w:r>
-        <w:rPr>
-          <w:rFonts w:ascii="Arial" w:eastAsia="Arial" w:hAnsi="Arial" w:cs="Arial"/>
-          <w:color w:val="1A1A1A"/>
-          <w:sz w:val="19"/>
-          <w:szCs w:val="19"/>
-        </w:rPr>
-        <w:t>,</w:t>
-      </w:r>
-      <w:r>
-        <w:rPr>
-          <w:rFonts w:ascii="Arial" w:eastAsia="Arial" w:hAnsi="Arial" w:cs="Arial"/>
-          <w:color w:val="1A1A1A"/>
-          <w:sz w:val="19"/>
-          <w:szCs w:val="19"/>
-        </w:rPr>
-        <w:t xml:space="preserve"> implementing JWT authentication, LDAP login, and route access control by Channel ID and Client Version to meet strict banking security requirements.</w:t>
-      </w:r>
-    </w:p>
-    <w:p>
-      <w:pPr>
-        <w:pStyle w:val="ListParagraph"/>
-        <w:numPr>
-          <w:ilvl w:val="0"/>
-          <w:numId w:val="2"/>
-        </w:numPr>
-        <w:spacing w:before="60" w:after="60"/>
-      </w:pPr>
-      <w:r>
-        <w:rPr>
-          <w:rFonts w:ascii="Arial" w:eastAsia="Arial" w:hAnsi="Arial" w:cs="Arial"/>
-          <w:color w:val="1A1A1A"/>
-          <w:sz w:val="19"/>
-          <w:szCs w:val="19"/>
-        </w:rPr>
-        <w:t>Designed RESTful APIs with role-based access control (RBAC), applying SOLID principles and design patterns (Factory, Singleton, Strategy) to deliver a maintainable, production-grade service in a regulated financial environment.</w:t>
-      </w:r>
-    </w:p>
-    <w:p>
-      <w:pPr>
-        <w:spacing w:before="160" w:after="40"/>
-      </w:pPr>
-      <w:r>
-        <w:rPr>
-          <w:rFonts w:ascii="Arial" w:eastAsia="Arial" w:hAnsi="Arial" w:cs="Arial"/>
-          <w:b/>
-          <w:bCs/>
-          <w:color w:val="1A1A1A"/>
-          <w:sz w:val="21"/>
-          <w:szCs w:val="21"/>
-        </w:rPr>
-        <w:t>Inspire for Solutions Development</w:t>
-      </w:r>
-      <w:r>
-        <w:rPr>
-          <w:rFonts w:ascii="Arial" w:eastAsia="Arial" w:hAnsi="Arial" w:cs="Arial"/>
-          <w:color w:val="555555"/>
-          <w:sz w:val="21"/>
-          <w:szCs w:val="21"/>
-        </w:rPr>
-        <w:t xml:space="preserve">  |  </w:t>
-      </w:r>
-      <w:r>
-        <w:rPr>
-          <w:rFonts w:ascii="Arial" w:eastAsia="Arial" w:hAnsi="Arial" w:cs="Arial"/>
-          <w:b/>
-          <w:bCs/>
-          <w:color w:val="1A1A1A"/>
-          <w:sz w:val="21"/>
-          <w:szCs w:val="21"/>
-        </w:rPr>
-        <w:t>Java Developer</w:t>
-      </w:r>
-      <w:r>
-        <w:rPr>
-          <w:rFonts w:ascii="Arial" w:eastAsia="Arial" w:hAnsi="Arial" w:cs="Arial"/>
-          <w:i/>
-          <w:iCs/>
-          <w:color w:val="555555"/>
-          <w:sz w:val="19"/>
-          <w:szCs w:val="19"/>
-        </w:rPr>
-        <w:t xml:space="preserve">    Sep 2024 – Jun 2025</w:t>
-      </w:r>
-    </w:p>
-    <w:p>
-      <w:pPr>
-        <w:pStyle w:val="ListParagraph"/>
-        <w:numPr>
-          <w:ilvl w:val="0"/>
-          <w:numId w:val="2"/>
-        </w:numPr>
-        <w:spacing w:before="60" w:after="60"/>
-      </w:pPr>
-      <w:r>
-        <w:rPr>
-          <w:rFonts w:ascii="Arial" w:eastAsia="Arial" w:hAnsi="Arial" w:cs="Arial"/>
-          <w:color w:val="1A1A1A"/>
-          <w:sz w:val="19"/>
-          <w:szCs w:val="19"/>
-        </w:rPr>
-        <w:t>Designed and built a scalable microservices banking application using Spring Boot, Kafka for async inter-service messaging, GraphQL for flexible data fetching, and the Saga pattern for distributed transaction reliability</w:t>
-      </w:r>
-      <w:r>
-        <w:rPr>
-          <w:rFonts w:ascii="Arial" w:eastAsia="Arial" w:hAnsi="Arial" w:cs="Arial"/>
-          <w:color w:val="1A1A1A"/>
-          <w:sz w:val="19"/>
-          <w:szCs w:val="19"/>
-        </w:rPr>
-        <w:t>,</w:t>
-      </w:r>
-      <w:r>
-        <w:rPr>
-          <w:rFonts w:ascii="Arial" w:eastAsia="Arial" w:hAnsi="Arial" w:cs="Arial"/>
-          <w:color w:val="1A1A1A"/>
-          <w:sz w:val="19"/>
-          <w:szCs w:val="19"/>
-        </w:rPr>
-        <w:t xml:space="preserve"> deployed via Docker.</w:t>
-      </w:r>
-    </w:p>
-    <w:p>
-      <w:pPr>
-        <w:pStyle w:val="ListParagraph"/>
-        <w:numPr>
-          <w:ilvl w:val="0"/>
-          <w:numId w:val="2"/>
-        </w:numPr>
-        <w:spacing w:before="60" w:after="60"/>
-      </w:pPr>
-      <w:r>
-        <w:rPr>
-          <w:rFonts w:ascii="Arial" w:eastAsia="Arial" w:hAnsi="Arial" w:cs="Arial"/>
-          <w:color w:val="1A1A1A"/>
-          <w:sz w:val="19"/>
-          <w:szCs w:val="19"/>
-        </w:rPr>
-        <w:lastRenderedPageBreak/>
         <w:t>Implemented end-to-end observability using Prometheus for real-time metrics and Zipkin for distributed tracing, and enforced fine-grained authentication via Keycloak with role-based access control across all services.</w:t>
       </w:r>
     </w:p>
@@ -792,6 +658,7 @@
           <w:sz w:val="19"/>
           <w:szCs w:val="19"/>
         </w:rPr>
+        <w:lastRenderedPageBreak/>
         <w:t>Manara Problem Solving Program</w:t>
       </w:r>
       <w:r>

</xml_diff>